<commit_message>
Pale King: restore the 'Machines vs. people' quotation to its paragraph
Co-Authored-By: Claude Sonnet 5.5 <noreply@anthropic.com>
</commit_message>
<xml_diff>
--- a/content-src/docx/R TLS 2011 04 15 DFW Pale King.docx
+++ b/content-src/docx/R TLS 2011 04 15 DFW Pale King.docx
@@ -338,16 +338,13 @@
         <w:t xml:space="preserve"> that Wallace had not decided how that plot was to pan out, or how the characters would play their parts in it, or even what the characters’ personal destinies and motivations were to be. Some of Wallace’s suggestions to himself make the novel seem frankly banal, as he reduces his various themes to a set of crude dichotomies: </w:t>
       </w:r>
       <w:r>
-        <w:t xml:space="preserve">&lt;quote&gt;</w:t>
+        <w:t xml:space="preserve">“</w:t>
       </w:r>
       <w:r>
         <w:t xml:space="preserve">Machines vs. people at performing mindless jobs … Being individual vs. being part of larger things—paying taxes, being ‘lone gun’ in IRS vs. team player</w:t>
       </w:r>
       <w:r>
-        <w:t xml:space="preserve">.</w:t>
-      </w:r>
-      <w:r>
-        <w:t xml:space="preserve">&lt;/quote&gt;</w:t>
+        <w:t xml:space="preserve">”.</w:t>
       </w:r>
       <w:r>
         <w:t xml:space="preserve"> Yet what is here—albeit frag</w:t>

</xml_diff>